<commit_message>
design document updated - target db structure
</commit_message>
<xml_diff>
--- a/docs/Reporting Platform.docx
+++ b/docs/Reporting Platform.docx
@@ -408,10 +408,10 @@
           <w:szCs w:val="28"/>
         </w:rPr>
         <w:drawing>
-          <wp:inline distT="0" distB="0" distL="0" distR="0" wp14:anchorId="0DB94B24" wp14:editId="36F0D817">
-            <wp:extent cx="5932170" cy="2127885"/>
-            <wp:effectExtent l="0" t="0" r="0" b="5715"/>
-            <wp:docPr id="617845915" name="Picture 3"/>
+          <wp:inline distT="0" distB="0" distL="0" distR="0" wp14:anchorId="7AB0826D" wp14:editId="5E3AC69E">
+            <wp:extent cx="5937885" cy="5468620"/>
+            <wp:effectExtent l="0" t="0" r="5715" b="0"/>
+            <wp:docPr id="229105981" name="Picture 1"/>
             <wp:cNvGraphicFramePr>
               <a:graphicFrameLocks xmlns:a="http://schemas.openxmlformats.org/drawingml/2006/main" noChangeAspect="1"/>
             </wp:cNvGraphicFramePr>
@@ -419,13 +419,13 @@
               <a:graphicData uri="http://schemas.openxmlformats.org/drawingml/2006/picture">
                 <pic:pic xmlns:pic="http://schemas.openxmlformats.org/drawingml/2006/picture">
                   <pic:nvPicPr>
-                    <pic:cNvPr id="0" name="Picture 3"/>
+                    <pic:cNvPr id="0" name="Picture 1"/>
                     <pic:cNvPicPr>
                       <a:picLocks noChangeAspect="1" noChangeArrowheads="1"/>
                     </pic:cNvPicPr>
                   </pic:nvPicPr>
                   <pic:blipFill>
-                    <a:blip r:embed="rId5" cstate="print">
+                    <a:blip r:embed="rId5">
                       <a:extLst>
                         <a:ext uri="{28A0092B-C50C-407E-A947-70E740481C1C}">
                           <a14:useLocalDpi xmlns:a14="http://schemas.microsoft.com/office/drawing/2010/main" val="0"/>
@@ -440,7 +440,7 @@
                   <pic:spPr bwMode="auto">
                     <a:xfrm>
                       <a:off x="0" y="0"/>
-                      <a:ext cx="5932170" cy="2127885"/>
+                      <a:ext cx="5937885" cy="5468620"/>
                     </a:xfrm>
                     <a:prstGeom prst="rect">
                       <a:avLst/>
@@ -548,6 +548,7 @@
           <w:sz w:val="28"/>
           <w:szCs w:val="28"/>
         </w:rPr>
+        <w:lastRenderedPageBreak/>
         <w:drawing>
           <wp:inline distT="0" distB="0" distL="0" distR="0" wp14:anchorId="305C85E4" wp14:editId="53852BDE">
             <wp:extent cx="5920154" cy="2033856"/>

</xml_diff>